<commit_message>
Actualiza propuesta: CCB/RUT/banco BLT renovados, cédula y estados financieros verificados legibles
</commit_message>
<xml_diff>
--- a/Propuesta-Tecnica-ECI-BLT-Cydesys.docx
+++ b/Propuesta-Tecnica-ECI-BLT-Cydesys.docx
@@ -381,7 +381,7 @@
           <w:i w:val="0"/>
           <w:sz w:val="22"/>
         </w:rPr>
-        <w:t>Resumen de estado de los requisitos jurídicos, financieros y de experiencia mínima exigidos por el TdR, por integrante de la Unión Temporal. Estado verificado el 5 de septiembre de 2026.</w:t>
+        <w:t>Resumen de estado de los requisitos jurídicos, financieros y de experiencia mínima exigidos por el TdR, por integrante de la Unión Temporal. Estado verificado el 5 de septiembre de 2026 (actualizado con los documentos de BLT renovados en agosto de 2026).</w:t>
       </w:r>
     </w:p>
     <w:tbl>
@@ -494,7 +494,135 @@
                 <w:color w:val="12805A"/>
                 <w:sz w:val="19"/>
               </w:rPr>
-              <w:t>Recibido (19-may-2026)</w:t>
+              <w:t>Renovado (26-ago-2026)</w:t>
+            </w:r>
+          </w:p>
+        </w:tc>
+        <w:tc>
+          <w:tcPr>
+            <w:tcW w:type="dxa" w:w="2160"/>
+          </w:tcPr>
+          <w:p>
+            <w:r/>
+            <w:r>
+              <w:rPr>
+                <w:b/>
+                <w:color w:val="B4560D"/>
+                <w:sz w:val="19"/>
+              </w:rPr>
+              <w:t>Pendiente de verificar</w:t>
+            </w:r>
+          </w:p>
+        </w:tc>
+        <w:tc>
+          <w:tcPr>
+            <w:tcW w:type="dxa" w:w="2160"/>
+          </w:tcPr>
+          <w:p>
+            <w:r/>
+            <w:r>
+              <w:rPr>
+                <w:b/>
+                <w:color w:val="12805A"/>
+                <w:sz w:val="19"/>
+              </w:rPr>
+              <w:t>No / Posible</w:t>
+            </w:r>
+          </w:p>
+        </w:tc>
+      </w:tr>
+      <w:tr>
+        <w:tc>
+          <w:tcPr>
+            <w:tcW w:type="dxa" w:w="2160"/>
+          </w:tcPr>
+          <w:p>
+            <w:r/>
+            <w:r>
+              <w:rPr>
+                <w:sz w:val="19"/>
+              </w:rPr>
+              <w:t>Cámara de Comercio (&lt; 30 días)</w:t>
+            </w:r>
+          </w:p>
+        </w:tc>
+        <w:tc>
+          <w:tcPr>
+            <w:tcW w:type="dxa" w:w="2160"/>
+          </w:tcPr>
+          <w:p>
+            <w:r/>
+            <w:r>
+              <w:rPr>
+                <w:b/>
+                <w:color w:val="12805A"/>
+                <w:sz w:val="19"/>
+              </w:rPr>
+              <w:t>Renovada (26-ago-2026) — vigente</w:t>
+            </w:r>
+          </w:p>
+        </w:tc>
+        <w:tc>
+          <w:tcPr>
+            <w:tcW w:type="dxa" w:w="2160"/>
+          </w:tcPr>
+          <w:p>
+            <w:r/>
+            <w:r>
+              <w:rPr>
+                <w:b/>
+                <w:color w:val="A32F2F"/>
+                <w:sz w:val="19"/>
+              </w:rPr>
+              <w:t>Vencida (11-ago-2026) — renovar</w:t>
+            </w:r>
+          </w:p>
+        </w:tc>
+        <w:tc>
+          <w:tcPr>
+            <w:tcW w:type="dxa" w:w="2160"/>
+          </w:tcPr>
+          <w:p>
+            <w:r/>
+            <w:r>
+              <w:rPr>
+                <w:b/>
+                <w:color w:val="A32F2F"/>
+                <w:sz w:val="19"/>
+              </w:rPr>
+              <w:t>Solo Cydesys</w:t>
+            </w:r>
+          </w:p>
+        </w:tc>
+      </w:tr>
+      <w:tr>
+        <w:tc>
+          <w:tcPr>
+            <w:tcW w:type="dxa" w:w="2160"/>
+          </w:tcPr>
+          <w:p>
+            <w:r/>
+            <w:r>
+              <w:rPr>
+                <w:sz w:val="19"/>
+              </w:rPr>
+              <w:t>Estados financieros 2025</w:t>
+            </w:r>
+          </w:p>
+        </w:tc>
+        <w:tc>
+          <w:tcPr>
+            <w:tcW w:type="dxa" w:w="2160"/>
+          </w:tcPr>
+          <w:p>
+            <w:r/>
+            <w:r>
+              <w:rPr>
+                <w:b/>
+                <w:color w:val="12805A"/>
+                <w:sz w:val="19"/>
+              </w:rPr>
+              <w:t>Recibido y verificado — legible, firmado</w:t>
             </w:r>
           </w:p>
         </w:tc>
@@ -526,135 +654,7 @@
                 <w:color w:val="B4560D"/>
                 <w:sz w:val="19"/>
               </w:rPr>
-              <w:t>Posible</w:t>
-            </w:r>
-          </w:p>
-        </w:tc>
-      </w:tr>
-      <w:tr>
-        <w:tc>
-          <w:tcPr>
-            <w:tcW w:type="dxa" w:w="2160"/>
-          </w:tcPr>
-          <w:p>
-            <w:r/>
-            <w:r>
-              <w:rPr>
-                <w:sz w:val="19"/>
-              </w:rPr>
-              <w:t>Cámara de Comercio (&lt; 30 días)</w:t>
-            </w:r>
-          </w:p>
-        </w:tc>
-        <w:tc>
-          <w:tcPr>
-            <w:tcW w:type="dxa" w:w="2160"/>
-          </w:tcPr>
-          <w:p>
-            <w:r/>
-            <w:r>
-              <w:rPr>
-                <w:b/>
-                <w:color w:val="A32F2F"/>
-                <w:sz w:val="19"/>
-              </w:rPr>
-              <w:t>Vencida — renovar</w:t>
-            </w:r>
-          </w:p>
-        </w:tc>
-        <w:tc>
-          <w:tcPr>
-            <w:tcW w:type="dxa" w:w="2160"/>
-          </w:tcPr>
-          <w:p>
-            <w:r/>
-            <w:r>
-              <w:rPr>
-                <w:b/>
-                <w:color w:val="A32F2F"/>
-                <w:sz w:val="19"/>
-              </w:rPr>
-              <w:t>Vencida (11-ago-2026) — renovar</w:t>
-            </w:r>
-          </w:p>
-        </w:tc>
-        <w:tc>
-          <w:tcPr>
-            <w:tcW w:type="dxa" w:w="2160"/>
-          </w:tcPr>
-          <w:p>
-            <w:r/>
-            <w:r>
-              <w:rPr>
-                <w:b/>
-                <w:color w:val="A32F2F"/>
-                <w:sz w:val="19"/>
-              </w:rPr>
-              <w:t>Sí</w:t>
-            </w:r>
-          </w:p>
-        </w:tc>
-      </w:tr>
-      <w:tr>
-        <w:tc>
-          <w:tcPr>
-            <w:tcW w:type="dxa" w:w="2160"/>
-          </w:tcPr>
-          <w:p>
-            <w:r/>
-            <w:r>
-              <w:rPr>
-                <w:sz w:val="19"/>
-              </w:rPr>
-              <w:t>Estados financieros 2025</w:t>
-            </w:r>
-          </w:p>
-        </w:tc>
-        <w:tc>
-          <w:tcPr>
-            <w:tcW w:type="dxa" w:w="2160"/>
-          </w:tcPr>
-          <w:p>
-            <w:r/>
-            <w:r>
-              <w:rPr>
-                <w:b/>
-                <w:color w:val="B4560D"/>
-                <w:sz w:val="19"/>
-              </w:rPr>
-              <w:t>Recibido, verificar legibilidad</w:t>
-            </w:r>
-          </w:p>
-        </w:tc>
-        <w:tc>
-          <w:tcPr>
-            <w:tcW w:type="dxa" w:w="2160"/>
-          </w:tcPr>
-          <w:p>
-            <w:r/>
-            <w:r>
-              <w:rPr>
-                <w:b/>
-                <w:color w:val="B4560D"/>
-                <w:sz w:val="19"/>
-              </w:rPr>
-              <w:t>Pendiente de verificar</w:t>
-            </w:r>
-          </w:p>
-        </w:tc>
-        <w:tc>
-          <w:tcPr>
-            <w:tcW w:type="dxa" w:w="2160"/>
-          </w:tcPr>
-          <w:p>
-            <w:r/>
-            <w:r>
-              <w:rPr>
-                <w:b/>
-                <w:color w:val="B4560D"/>
-                <w:sz w:val="19"/>
-              </w:rPr>
-              <w:t>Posible</w:t>
+              <w:t>No / Posible</w:t>
             </w:r>
           </w:p>
         </w:tc>
@@ -686,7 +686,7 @@
                 <w:color w:val="12805A"/>
                 <w:sz w:val="19"/>
               </w:rPr>
-              <w:t>Vigente (14-may-2026)</w:t>
+              <w:t>Renovada (26-ago-2026)</w:t>
             </w:r>
           </w:p>
         </w:tc>
@@ -798,7 +798,7 @@
               <w:rPr>
                 <w:sz w:val="19"/>
               </w:rPr>
-              <w:t>Cédula representante legal</w:t>
+              <w:t>Antecedentes Policía Nacional (rep. legal)</w:t>
             </w:r>
           </w:p>
         </w:tc>
@@ -811,10 +811,10 @@
             <w:r>
               <w:rPr>
                 <w:b/>
-                <w:color w:val="A32F2F"/>
+                <w:color w:val="12805A"/>
                 <w:sz w:val="19"/>
               </w:rPr>
-              <w:t>Reenviar — archivo vacío</w:t>
+              <w:t>Recibido — sin antecedentes</w:t>
             </w:r>
           </w:p>
         </w:tc>
@@ -843,10 +843,10 @@
             <w:r>
               <w:rPr>
                 <w:b/>
-                <w:color w:val="B4560D"/>
+                <w:color w:val="12805A"/>
                 <w:sz w:val="19"/>
               </w:rPr>
-              <w:t>Posible</w:t>
+              <w:t>No</w:t>
             </w:r>
           </w:p>
         </w:tc>
@@ -862,7 +862,71 @@
               <w:rPr>
                 <w:sz w:val="19"/>
               </w:rPr>
-              <w:t>Certificados de experiencia (mín. 3)</w:t>
+              <w:t>Cédula representante legal</w:t>
+            </w:r>
+          </w:p>
+        </w:tc>
+        <w:tc>
+          <w:tcPr>
+            <w:tcW w:type="dxa" w:w="2160"/>
+          </w:tcPr>
+          <w:p>
+            <w:r/>
+            <w:r>
+              <w:rPr>
+                <w:b/>
+                <w:color w:val="12805A"/>
+                <w:sz w:val="19"/>
+              </w:rPr>
+              <w:t>Verificada — escaneo legible y vigente hasta 2034</w:t>
+            </w:r>
+          </w:p>
+        </w:tc>
+        <w:tc>
+          <w:tcPr>
+            <w:tcW w:type="dxa" w:w="2160"/>
+          </w:tcPr>
+          <w:p>
+            <w:r/>
+            <w:r>
+              <w:rPr>
+                <w:b/>
+                <w:color w:val="B4560D"/>
+                <w:sz w:val="19"/>
+              </w:rPr>
+              <w:t>Pendiente de verificar</w:t>
+            </w:r>
+          </w:p>
+        </w:tc>
+        <w:tc>
+          <w:tcPr>
+            <w:tcW w:type="dxa" w:w="2160"/>
+          </w:tcPr>
+          <w:p>
+            <w:r/>
+            <w:r>
+              <w:rPr>
+                <w:b/>
+                <w:color w:val="12805A"/>
+                <w:sz w:val="19"/>
+              </w:rPr>
+              <w:t>No</w:t>
+            </w:r>
+          </w:p>
+        </w:tc>
+      </w:tr>
+      <w:tr>
+        <w:tc>
+          <w:tcPr>
+            <w:tcW w:type="dxa" w:w="2160"/>
+          </w:tcPr>
+          <w:p>
+            <w:r/>
+            <w:r>
+              <w:rPr>
+                <w:sz w:val="19"/>
+              </w:rPr>
+              <w:t>Certificados de experiencia (mín. 3 por integrante)</w:t>
             </w:r>
           </w:p>
         </w:tc>
@@ -891,10 +955,10 @@
             <w:r>
               <w:rPr>
                 <w:b/>
-                <w:color w:val="12805A"/>
+                <w:color w:val="A32F2F"/>
                 <w:sz w:val="19"/>
               </w:rPr>
-              <w:t>1 carta ya incluida (Cyberware)</w:t>
+              <w:t>Sin certificación propia</w:t>
             </w:r>
           </w:p>
         </w:tc>
@@ -907,10 +971,10 @@
             <w:r>
               <w:rPr>
                 <w:b/>
-                <w:color w:val="12805A"/>
+                <w:color w:val="A32F2F"/>
                 <w:sz w:val="19"/>
               </w:rPr>
-              <w:t>No, con nota</w:t>
+              <w:t>Posible (Cydesys)</w:t>
             </w:r>
           </w:p>
         </w:tc>
@@ -1176,16 +1240,11 @@
       <w:r>
         <w:rPr>
           <w:b/>
-          <w:color w:val="A32F2F"/>
+          <w:i w:val="0"/>
+          <w:color w:val="12805A"/>
+          <w:sz w:val="22"/>
         </w:rPr>
-        <w:t xml:space="preserve">⚠ ALERTA — </w:t>
-      </w:r>
-      <w:r>
-        <w:rPr>
-          <w:b w:val="0"/>
-          <w:color w:val="A32F2F"/>
-        </w:rPr>
-        <w:t>Tres Cámaras de Comercio deben renovarse antes de radicar (BLT y Cydesys) — el TdR exige máximo 30 días de expedición. Este es hoy el riesgo más alto de todo el expediente.</w:t>
+        <w:t>✓ Resuelto en esta actualización (5-sep): BLT renovó Cámara de Comercio, RUT y certificación bancaria el 26 de agosto de 2026 — vigentes y dentro del límite de 30 días para el 7-sep y el 16-sep. Se verificó además que la cédula del representante legal y los estados financieros 2025 SÍ tienen contenido completo y legible (el problema anterior fue solo un fallo de conversión automática a texto, no un documento faltante) y se recibió un nuevo certificado de antecedentes de la Policía Nacional de Camilo Gómez Uribe, sin reportes.</w:t>
       </w:r>
     </w:p>
     <w:p>
@@ -1201,7 +1260,7 @@
           <w:b w:val="0"/>
           <w:color w:val="A32F2F"/>
         </w:rPr>
-        <w:t>La cédula del representante legal de BLT (Camilo Gómez Uribe) llegó como archivo vacío — debe reenviarse el escaneo original antes del cierre.</w:t>
+        <w:t>La Cámara de Comercio de Cydesys/Cyberware sigue siendo la del 11 de agosto de 2026. Para la fecha de la propuesta final (16 de septiembre de 2026) tendrá 36 días de antigüedad — supera el límite de 30 días calendario que exige el TdR. Debe re-expedirse. Este es hoy el bloqueante jurídico más urgente del expediente.</w:t>
       </w:r>
     </w:p>
     <w:p>
@@ -1233,22 +1292,6 @@
           <w:b w:val="0"/>
           <w:color w:val="A32F2F"/>
         </w:rPr>
-        <w:t>La Cámara de Comercio de Cydesys/Cyberware fue expedida el 11 de agosto de 2026. Para la fecha de la propuesta final (16 de septiembre de 2026) tendrá 36 días de antigüedad — supera el límite de 30 días calendario que exige el TdR. Debe re-expedirse.</w:t>
-      </w:r>
-    </w:p>
-    <w:p>
-      <w:r>
-        <w:rPr>
-          <w:b/>
-          <w:color w:val="A32F2F"/>
-        </w:rPr>
-        <w:t xml:space="preserve">⚠ ALERTA — </w:t>
-      </w:r>
-      <w:r>
-        <w:rPr>
-          <w:b w:val="0"/>
-          <w:color w:val="A32F2F"/>
-        </w:rPr>
         <w:t>Faltan los estados financieros de PRUEBA / intermedios de 2026 (no solo los de cierre 2025) de BLT y de Cydesys — el TdR los exige explícitamente además de los auditados de 2025.</w:t>
       </w:r>
     </w:p>
@@ -1265,7 +1308,7 @@
           <w:b w:val="0"/>
           <w:color w:val="A32F2F"/>
         </w:rPr>
-        <w:t>Detectado en el repositorio de trabajo un formulario de vinculación de un tercero (mayorista Adistec) con datos financieros de BLT de 2022 — NO corresponde a este proceso ni sustituye los estados financieros oficiales exigidos por la ECI. No debe incluirse en la propuesta.</w:t>
+        <w:t>Detectado en el repositorio de trabajo un formulario de vinculación de un tercero (mayorista Adistec, código FV-CP-2022) — NO corresponde a este proceso ni sustituye los estados financieros oficiales exigidos por la ECI. No debe incluirse en la propuesta.</w:t>
       </w:r>
     </w:p>
     <w:p>
@@ -2908,18 +2951,7 @@
         <w:rPr>
           <w:color w:val="A32F2F"/>
         </w:rPr>
-        <w:t>Cámara de Comercio de BLT y de Cydesys vencidas para la fecha de cierre (Cydesys: 36 días de antigüedad para el 16-sep, supera el límite de 30) — renovar antes de radicar.</w:t>
-      </w:r>
-    </w:p>
-    <w:p>
-      <w:pPr>
-        <w:pStyle w:val="ListBullet"/>
-      </w:pPr>
-      <w:r>
-        <w:rPr>
-          <w:color w:val="A32F2F"/>
-        </w:rPr>
-        <w:t>Cédula del representante legal de BLT — archivo vacío, reenviar.</w:t>
+        <w:t>Cámara de Comercio de Cydesys vencida para la fecha de cierre (36 días de antigüedad para el 16-sep, supera el límite de 30) — renovar antes de radicar.</w:t>
       </w:r>
     </w:p>
     <w:p>
@@ -2952,17 +2984,6 @@
         <w:rPr>
           <w:color w:val="A32F2F"/>
         </w:rPr>
-        <w:t>Estados financieros de PRUEBA/intermedios 2026 de BLT y de Cydesys — no aportados, solo los de cierre 2025.</w:t>
-      </w:r>
-    </w:p>
-    <w:p>
-      <w:pPr>
-        <w:pStyle w:val="ListBullet"/>
-      </w:pPr>
-      <w:r>
-        <w:rPr>
-          <w:color w:val="A32F2F"/>
-        </w:rPr>
         <w:t>Certificación de experiencia propia de Cydesys/Cyberware — no aportada; solo hay referencias de BLT.</w:t>
       </w:r>
     </w:p>
@@ -2976,6 +2997,28 @@
           <w:sz w:val="27"/>
         </w:rPr>
         <w:t>Riesgo medio — necesario antes del 16 de septiembre</w:t>
+      </w:r>
+    </w:p>
+    <w:p>
+      <w:pPr>
+        <w:pStyle w:val="ListBullet"/>
+      </w:pPr>
+      <w:r>
+        <w:rPr>
+          <w:color w:val="B4560D"/>
+        </w:rPr>
+        <w:t>Estados financieros de PRUEBA/intermedios 2026 de BLT y de Cydesys — no aportados, solo los de cierre 2025 (ya verificados y legibles).</w:t>
+      </w:r>
+    </w:p>
+    <w:p>
+      <w:pPr>
+        <w:pStyle w:val="ListBullet"/>
+      </w:pPr>
+      <w:r>
+        <w:rPr>
+          <w:color w:val="B4560D"/>
+        </w:rPr>
+        <w:t>Documentación jurídica/financiera de Cydesys (RUT, certificación bancaria, Contraloría/Procuraduría) — pendiente de verificar vigencia y legibilidad, igual que se hizo con BLT.</w:t>
       </w:r>
     </w:p>
     <w:p>
@@ -3031,17 +3074,6 @@
           <w:color w:val="B4560D"/>
         </w:rPr>
         <w:t>Decisión final HPE vs. Dell — pendiente, bloquea el diligenciamiento definitivo del Anexo 2.</w:t>
-      </w:r>
-    </w:p>
-    <w:p>
-      <w:pPr>
-        <w:pStyle w:val="ListBullet"/>
-      </w:pPr>
-      <w:r>
-        <w:rPr>
-          <w:color w:val="B4560D"/>
-        </w:rPr>
-        <w:t>Estados financieros de BLT y documentación completa de Cydesys — pendientes de verificación final.</w:t>
       </w:r>
     </w:p>
     <w:p>
@@ -3133,6 +3165,62 @@
           <w:color w:val="12805A"/>
         </w:rPr>
         <w:t>Arquitectura de la solución, continuidad/migración, HA/DR y seguridad, ANS/SLA, modelo comercial: 100% documentados y listos.</w:t>
+      </w:r>
+    </w:p>
+    <w:p>
+      <w:pPr>
+        <w:pStyle w:val="Heading2"/>
+      </w:pPr>
+      <w:r>
+        <w:rPr>
+          <w:color w:val="0B5ED7"/>
+          <w:sz w:val="27"/>
+        </w:rPr>
+        <w:t>Resuelto en esta actualización (5-sep)</w:t>
+      </w:r>
+    </w:p>
+    <w:p>
+      <w:pPr>
+        <w:pStyle w:val="ListBullet"/>
+      </w:pPr>
+      <w:r>
+        <w:rPr>
+          <w:color w:val="12805A"/>
+        </w:rPr>
+        <w:t>Cámara de Comercio, RUT y certificación bancaria de BLT — renovados el 26 de agosto de 2026, vigentes dentro del límite de 30 días.</w:t>
+      </w:r>
+    </w:p>
+    <w:p>
+      <w:pPr>
+        <w:pStyle w:val="ListBullet"/>
+      </w:pPr>
+      <w:r>
+        <w:rPr>
+          <w:color w:val="12805A"/>
+        </w:rPr>
+        <w:t>Cédula del representante legal de BLT — verificada, escaneo legible y vigente hasta 2034 (el problema anterior era un fallo de conversión automática, no un documento faltante).</w:t>
+      </w:r>
+    </w:p>
+    <w:p>
+      <w:pPr>
+        <w:pStyle w:val="ListBullet"/>
+      </w:pPr>
+      <w:r>
+        <w:rPr>
+          <w:color w:val="12805A"/>
+        </w:rPr>
+        <w:t>Estados financieros 2025 de BLT — verificados, contenido completo y legible, firmados por el representante legal y el contador público.</w:t>
+      </w:r>
+    </w:p>
+    <w:p>
+      <w:pPr>
+        <w:pStyle w:val="ListBullet"/>
+      </w:pPr>
+      <w:r>
+        <w:rPr>
+          <w:color w:val="12805A"/>
+        </w:rPr>
+        <w:t>Nuevo certificado de antecedentes de la Policía Nacional del representante legal — sin antecedentes penales ni requerimientos judiciales.</w:t>
       </w:r>
     </w:p>
     <w:p/>

</xml_diff>

<commit_message>
Actualiza propuesta: RUT y estados financieros de Cydesys verificados legibles
</commit_message>
<xml_diff>
--- a/Propuesta-Tecnica-ECI-BLT-Cydesys.docx
+++ b/Propuesta-Tecnica-ECI-BLT-Cydesys.docx
@@ -507,10 +507,10 @@
             <w:r>
               <w:rPr>
                 <w:b/>
-                <w:color w:val="B4560D"/>
+                <w:color w:val="12805A"/>
                 <w:sz w:val="19"/>
               </w:rPr>
-              <w:t>Pendiente de verificar</w:t>
+              <w:t>Actualizado (11-ago-2026) — verificado</w:t>
             </w:r>
           </w:p>
         </w:tc>
@@ -526,7 +526,7 @@
                 <w:color w:val="12805A"/>
                 <w:sz w:val="19"/>
               </w:rPr>
-              <w:t>No / Posible</w:t>
+              <w:t>No</w:t>
             </w:r>
           </w:p>
         </w:tc>
@@ -635,10 +635,10 @@
             <w:r>
               <w:rPr>
                 <w:b/>
-                <w:color w:val="B4560D"/>
+                <w:color w:val="12805A"/>
                 <w:sz w:val="19"/>
               </w:rPr>
-              <w:t>Pendiente de verificar</w:t>
+              <w:t>Recibido y verificado — legible, firmado</w:t>
             </w:r>
           </w:p>
         </w:tc>
@@ -651,10 +651,10 @@
             <w:r>
               <w:rPr>
                 <w:b/>
-                <w:color w:val="B4560D"/>
+                <w:color w:val="12805A"/>
                 <w:sz w:val="19"/>
               </w:rPr>
-              <w:t>No / Posible</w:t>
+              <w:t>No</w:t>
             </w:r>
           </w:p>
         </w:tc>
@@ -1244,7 +1244,7 @@
           <w:color w:val="12805A"/>
           <w:sz w:val="22"/>
         </w:rPr>
-        <w:t>✓ Resuelto en esta actualización (5-sep): BLT renovó Cámara de Comercio, RUT y certificación bancaria el 26 de agosto de 2026 — vigentes y dentro del límite de 30 días para el 7-sep y el 16-sep. Se verificó además que la cédula del representante legal y los estados financieros 2025 SÍ tienen contenido completo y legible (el problema anterior fue solo un fallo de conversión automática a texto, no un documento faltante) y se recibió un nuevo certificado de antecedentes de la Policía Nacional de Camilo Gómez Uribe, sin reportes.</w:t>
+        <w:t>✓ Resuelto en esta actualización (5-sep): BLT renovó Cámara de Comercio, RUT y certificación bancaria el 26 de agosto de 2026 — vigentes y dentro del límite de 30 días para el 7-sep y el 16-sep. Se verificó además que la cédula del representante legal y los estados financieros 2025 SÍ tienen contenido completo y legible (el problema anterior fue solo un fallo de conversión automática a texto, no un documento faltante) y se recibió un nuevo certificado de antecedentes de la Policía Nacional de Camilo Gómez Uribe, sin reportes. Del lado de Cydesys: se recibió y verificó el RUT actualizado y los estados financieros 2025 (legibles, firmados por el representante legal y el contador público) — completos.</w:t>
       </w:r>
     </w:p>
     <w:p>
@@ -3018,7 +3018,7 @@
         <w:rPr>
           <w:color w:val="B4560D"/>
         </w:rPr>
-        <w:t>Documentación jurídica/financiera de Cydesys (RUT, certificación bancaria, Contraloría/Procuraduría) — pendiente de verificar vigencia y legibilidad, igual que se hizo con BLT.</w:t>
+        <w:t>Certificación bancaria, Contraloría y Procuraduría de Cydesys — aún pendientes de recibir/verificar (RUT y estados financieros 2025 ya verificados: legibles y completos).</w:t>
       </w:r>
     </w:p>
     <w:p>
@@ -3221,6 +3221,28 @@
           <w:color w:val="12805A"/>
         </w:rPr>
         <w:t>Nuevo certificado de antecedentes de la Policía Nacional del representante legal — sin antecedentes penales ni requerimientos judiciales.</w:t>
+      </w:r>
+    </w:p>
+    <w:p>
+      <w:pPr>
+        <w:pStyle w:val="ListBullet"/>
+      </w:pPr>
+      <w:r>
+        <w:rPr>
+          <w:color w:val="12805A"/>
+        </w:rPr>
+        <w:t>RUT de Cydesys/Cyberware — actualizado (11-ago-2026), verificado.</w:t>
+      </w:r>
+    </w:p>
+    <w:p>
+      <w:pPr>
+        <w:pStyle w:val="ListBullet"/>
+      </w:pPr>
+      <w:r>
+        <w:rPr>
+          <w:color w:val="12805A"/>
+        </w:rPr>
+        <w:t>Estados financieros 2025 de Cydesys/Cyberware — verificados, contenido completo y legible, firmados por el representante legal y el contador público.</w:t>
       </w:r>
     </w:p>
     <w:p/>

</xml_diff>